<commit_message>
Keeping things up to date.
</commit_message>
<xml_diff>
--- a/Chapter 19 - Mole.docx
+++ b/Chapter 19 - Mole.docx
@@ -197,15 +197,7 @@
     </w:p>
     <w:p>
       <w:r>
-        <w:t>“I can see your reason, but there a couple of enormous, pre-</w:t>
-      </w:r>
-      <w:proofErr w:type="spellStart"/>
-      <w:r>
-        <w:t>cambrian</w:t>
-      </w:r>
-      <w:proofErr w:type="spellEnd"/>
-      <w:r>
-        <w:t xml:space="preserve"> ere flies in this soothing ointment of yours?”</w:t>
+        <w:t>“I can see your reason, but there a couple of enormous, pre-cambrian ere flies in this soothing ointment of yours?”</w:t>
       </w:r>
     </w:p>
     <w:p>
@@ -306,23 +298,7 @@
       </w:r>
       <w:r>
         <w:br/>
-        <w:t xml:space="preserve">“And </w:t>
-      </w:r>
-      <w:proofErr w:type="spellStart"/>
-      <w:r>
-        <w:t>Mrs</w:t>
-      </w:r>
-      <w:proofErr w:type="spellEnd"/>
-      <w:r>
-        <w:t xml:space="preserve"> Ting’s </w:t>
-      </w:r>
-      <w:proofErr w:type="spellStart"/>
-      <w:r>
-        <w:t>neighbours</w:t>
-      </w:r>
-      <w:proofErr w:type="spellEnd"/>
-      <w:r>
-        <w:t xml:space="preserve"> aren’t German.”</w:t>
+        <w:t>“And Mrs Ting’s neighbours aren’t German.”</w:t>
       </w:r>
     </w:p>
     <w:p>
@@ -331,7 +307,13 @@
       </w:r>
       <w:r>
         <w:br/>
-        <w:t>“They’re not. They’re German.”</w:t>
+        <w:t xml:space="preserve">“They’re not. They’re </w:t>
+      </w:r>
+      <w:r>
+        <w:t>Swiss</w:t>
+      </w:r>
+      <w:r>
+        <w:t>.”</w:t>
       </w:r>
     </w:p>
     <w:p/>

</xml_diff>